<commit_message>
Search Bar and category part updated
</commit_message>
<xml_diff>
--- a/Desi-etsy report.docx
+++ b/Desi-etsy report.docx
@@ -60,8 +60,9 @@
           <w:sz w:val="48"/>
           <w:szCs w:val="48"/>
         </w:rPr>
-        <w:t>(</w:t>
-      </w:r>
+        <w:t>( A</w:t>
+      </w:r>
+      <w:proofErr w:type="gramEnd"/>
       <w:r>
         <w:rPr>
           <w:b/>
@@ -69,49 +70,48 @@
           <w:sz w:val="48"/>
           <w:szCs w:val="48"/>
         </w:rPr>
-        <w:t xml:space="preserve"> A</w:t>
-      </w:r>
-      <w:proofErr w:type="gramEnd"/>
-      <w:r>
+        <w:t xml:space="preserve"> Full-Stack MERN Application)</w:t>
+      </w:r>
+    </w:p>
+    <w:p>
+      <w:pPr>
+        <w:jc w:val="center"/>
         <w:rPr>
           <w:b/>
           <w:bCs/>
           <w:sz w:val="48"/>
           <w:szCs w:val="48"/>
         </w:rPr>
-        <w:t xml:space="preserve"> Full-Stack MERN Application</w:t>
-      </w:r>
-      <w:r>
+      </w:pPr>
+    </w:p>
+    <w:p>
+      <w:pPr>
+        <w:jc w:val="center"/>
         <w:rPr>
           <w:b/>
           <w:bCs/>
           <w:sz w:val="48"/>
           <w:szCs w:val="48"/>
         </w:rPr>
-        <w:t>)</w:t>
-      </w:r>
-    </w:p>
-    <w:p>
-      <w:pPr>
-        <w:jc w:val="center"/>
+      </w:pPr>
+      <w:r>
         <w:rPr>
           <w:b/>
           <w:bCs/>
           <w:sz w:val="48"/>
           <w:szCs w:val="48"/>
         </w:rPr>
-      </w:pPr>
-    </w:p>
-    <w:p>
-      <w:pPr>
-        <w:jc w:val="center"/>
+        <w:t>Project Duration:</w:t>
+      </w:r>
+      <w:r>
         <w:rPr>
           <w:b/>
           <w:bCs/>
           <w:sz w:val="48"/>
           <w:szCs w:val="48"/>
         </w:rPr>
-      </w:pPr>
+        <w:br/>
+      </w:r>
       <w:r>
         <w:rPr>
           <w:b/>
@@ -119,7 +119,7 @@
           <w:sz w:val="48"/>
           <w:szCs w:val="48"/>
         </w:rPr>
-        <w:t>Project Duration:</w:t>
+        <w:t>07/05/2025</w:t>
       </w:r>
       <w:r>
         <w:rPr>
@@ -128,7 +128,7 @@
           <w:sz w:val="48"/>
           <w:szCs w:val="48"/>
         </w:rPr>
-        <w:br/>
+        <w:t xml:space="preserve">– </w:t>
       </w:r>
       <w:r>
         <w:rPr>
@@ -137,7 +137,7 @@
           <w:sz w:val="48"/>
           <w:szCs w:val="48"/>
         </w:rPr>
-        <w:t>07/05/2025</w:t>
+        <w:t>0</w:t>
       </w:r>
       <w:r>
         <w:rPr>
@@ -146,7 +146,7 @@
           <w:sz w:val="48"/>
           <w:szCs w:val="48"/>
         </w:rPr>
-        <w:t xml:space="preserve">– </w:t>
+        <w:t>7</w:t>
       </w:r>
       <w:r>
         <w:rPr>
@@ -155,48 +155,48 @@
           <w:sz w:val="48"/>
           <w:szCs w:val="48"/>
         </w:rPr>
-        <w:t>07/07/2025</w:t>
-      </w:r>
-    </w:p>
-    <w:p>
-      <w:pPr>
-        <w:jc w:val="center"/>
+        <w:t>/0</w:t>
+      </w:r>
+      <w:r>
         <w:rPr>
           <w:b/>
           <w:bCs/>
           <w:sz w:val="48"/>
           <w:szCs w:val="48"/>
         </w:rPr>
-      </w:pPr>
-    </w:p>
-    <w:p>
-      <w:pPr>
-        <w:jc w:val="center"/>
+        <w:t>8</w:t>
+      </w:r>
+      <w:r>
         <w:rPr>
           <w:b/>
           <w:bCs/>
           <w:sz w:val="48"/>
           <w:szCs w:val="48"/>
         </w:rPr>
-      </w:pPr>
-      <w:r>
+        <w:t>/2025</w:t>
+      </w:r>
+    </w:p>
+    <w:p>
+      <w:pPr>
+        <w:jc w:val="center"/>
         <w:rPr>
           <w:b/>
           <w:bCs/>
           <w:sz w:val="48"/>
           <w:szCs w:val="48"/>
         </w:rPr>
-        <w:t>Submission Date:</w:t>
-      </w:r>
-      <w:r>
+      </w:pPr>
+    </w:p>
+    <w:p>
+      <w:pPr>
+        <w:jc w:val="center"/>
         <w:rPr>
           <w:b/>
           <w:bCs/>
           <w:sz w:val="48"/>
           <w:szCs w:val="48"/>
         </w:rPr>
-        <w:br/>
-      </w:r>
+      </w:pPr>
       <w:r>
         <w:rPr>
           <w:b/>
@@ -204,50 +204,44 @@
           <w:sz w:val="48"/>
           <w:szCs w:val="48"/>
         </w:rPr>
-        <w:t>12/07/2025</w:t>
-      </w:r>
-    </w:p>
-    <w:p>
-      <w:pPr>
-        <w:jc w:val="center"/>
+        <w:t>Submission Date:</w:t>
+      </w:r>
+      <w:r>
         <w:rPr>
           <w:b/>
           <w:bCs/>
           <w:sz w:val="48"/>
           <w:szCs w:val="48"/>
         </w:rPr>
-      </w:pPr>
-    </w:p>
-    <w:p>
-      <w:pPr>
-        <w:jc w:val="center"/>
+        <w:br/>
+      </w:r>
+      <w:r>
         <w:rPr>
           <w:b/>
           <w:bCs/>
           <w:sz w:val="48"/>
           <w:szCs w:val="48"/>
         </w:rPr>
-      </w:pPr>
-    </w:p>
-    <w:p>
-      <w:pPr>
-        <w:jc w:val="center"/>
+        <w:t>08</w:t>
+      </w:r>
+      <w:r>
         <w:rPr>
           <w:b/>
           <w:bCs/>
           <w:sz w:val="48"/>
           <w:szCs w:val="48"/>
         </w:rPr>
-      </w:pPr>
-    </w:p>
-    <w:p>
-      <w:pPr>
-        <w:jc w:val="center"/>
-        <w:rPr>
+        <w:t>/0</w:t>
+      </w:r>
+      <w:r>
+        <w:rPr>
+          <w:b/>
+          <w:bCs/>
           <w:sz w:val="48"/>
           <w:szCs w:val="48"/>
         </w:rPr>
-      </w:pPr>
+        <w:t>8</w:t>
+      </w:r>
       <w:r>
         <w:rPr>
           <w:b/>
@@ -255,93 +249,158 @@
           <w:sz w:val="48"/>
           <w:szCs w:val="48"/>
         </w:rPr>
-        <w:t>Submitted By:</w:t>
-      </w:r>
-      <w:r>
-        <w:rPr>
+        <w:t>/2025</w:t>
+      </w:r>
+    </w:p>
+    <w:p>
+      <w:pPr>
+        <w:jc w:val="center"/>
+        <w:rPr>
+          <w:b/>
+          <w:bCs/>
           <w:sz w:val="48"/>
           <w:szCs w:val="48"/>
         </w:rPr>
-        <w:br/>
-      </w:r>
-      <w:r>
+      </w:pPr>
+    </w:p>
+    <w:p>
+      <w:pPr>
+        <w:jc w:val="center"/>
         <w:rPr>
           <w:b/>
           <w:bCs/>
           <w:sz w:val="48"/>
           <w:szCs w:val="48"/>
         </w:rPr>
-        <w:t>Rohit Kumar</w:t>
-      </w:r>
-      <w:r>
-        <w:rPr>
+      </w:pPr>
+    </w:p>
+    <w:p>
+      <w:pPr>
+        <w:jc w:val="center"/>
+        <w:rPr>
+          <w:b/>
+          <w:bCs/>
           <w:sz w:val="48"/>
           <w:szCs w:val="48"/>
         </w:rPr>
-        <w:br/>
-      </w:r>
-      <w:r>
+      </w:pPr>
+    </w:p>
+    <w:p>
+      <w:pPr>
+        <w:jc w:val="center"/>
         <w:rPr>
           <w:sz w:val="48"/>
           <w:szCs w:val="48"/>
         </w:rPr>
-        <w:t>22CSE163(22UG010296)</w:t>
-      </w:r>
-      <w:r>
-        <w:rPr>
+      </w:pPr>
+      <w:r>
+        <w:rPr>
+          <w:b/>
+          <w:bCs/>
           <w:sz w:val="48"/>
           <w:szCs w:val="48"/>
         </w:rPr>
-        <w:br/>
+        <w:t>Submitted By:</w:t>
       </w:r>
       <w:r>
         <w:rPr>
           <w:sz w:val="48"/>
           <w:szCs w:val="48"/>
         </w:rPr>
-        <w:t>COMPUTER SCIENCE AND ENGINEERING</w:t>
-      </w:r>
-      <w:r>
-        <w:rPr>
+        <w:br/>
+      </w:r>
+      <w:r>
+        <w:rPr>
+          <w:b/>
+          <w:bCs/>
           <w:sz w:val="48"/>
           <w:szCs w:val="48"/>
         </w:rPr>
-        <w:br/>
+        <w:t>Nikita Choudhary</w:t>
       </w:r>
       <w:r>
         <w:rPr>
           <w:sz w:val="48"/>
           <w:szCs w:val="48"/>
         </w:rPr>
-        <w:t xml:space="preserve">GIET UNIVERSITY, </w:t>
-      </w:r>
-      <w:proofErr w:type="gramStart"/>
+        <w:br/>
+      </w:r>
       <w:r>
         <w:rPr>
           <w:sz w:val="48"/>
           <w:szCs w:val="48"/>
         </w:rPr>
-        <w:t>GUNUPUR,ODISHA</w:t>
-      </w:r>
-      <w:proofErr w:type="gramEnd"/>
-    </w:p>
-    <w:p>
-      <w:pPr>
-        <w:jc w:val="center"/>
-        <w:rPr>
-          <w:b/>
-          <w:bCs/>
+        <w:t>COMPUTER SCIENCE AND ENGINEERING</w:t>
+      </w:r>
+      <w:r>
+        <w:rPr>
           <w:sz w:val="48"/>
           <w:szCs w:val="48"/>
         </w:rPr>
-      </w:pPr>
-      <w:r>
-        <w:rPr>
-          <w:b/>
-          <w:bCs/>
+        <w:t>S</w:t>
+      </w:r>
+      <w:r>
+        <w:rPr>
           <w:sz w:val="48"/>
           <w:szCs w:val="48"/>
         </w:rPr>
+        <w:t>D</w:t>
+      </w:r>
+      <w:r>
+        <w:rPr>
+          <w:sz w:val="48"/>
+          <w:szCs w:val="48"/>
+        </w:rPr>
+        <w:t xml:space="preserve"> college of engineering and technology </w:t>
+      </w:r>
+      <w:proofErr w:type="spellStart"/>
+      <w:proofErr w:type="gramStart"/>
+      <w:r>
+        <w:rPr>
+          <w:sz w:val="48"/>
+          <w:szCs w:val="48"/>
+        </w:rPr>
+        <w:t>muzaffarnagar</w:t>
+      </w:r>
+      <w:proofErr w:type="spellEnd"/>
+      <w:r>
+        <w:rPr>
+          <w:sz w:val="48"/>
+          <w:szCs w:val="48"/>
+        </w:rPr>
+        <w:t xml:space="preserve"> </w:t>
+      </w:r>
+      <w:r>
+        <w:rPr>
+          <w:sz w:val="48"/>
+          <w:szCs w:val="48"/>
+        </w:rPr>
+        <w:t>,</w:t>
+      </w:r>
+      <w:proofErr w:type="gramEnd"/>
+      <w:r>
+        <w:rPr>
+          <w:sz w:val="48"/>
+          <w:szCs w:val="48"/>
+        </w:rPr>
+        <w:t xml:space="preserve"> UP</w:t>
+      </w:r>
+    </w:p>
+    <w:p>
+      <w:pPr>
+        <w:jc w:val="center"/>
+        <w:rPr>
+          <w:sz w:val="48"/>
+          <w:szCs w:val="48"/>
+        </w:rPr>
+      </w:pPr>
+      <w:r>
+        <w:rPr>
+          <w:b/>
+          <w:bCs/>
+          <w:sz w:val="48"/>
+          <w:szCs w:val="48"/>
+        </w:rPr>
         <w:lastRenderedPageBreak/>
         <w:t>Introduction</w:t>
       </w:r>
@@ -531,7 +590,24 @@
           <w:sz w:val="28"/>
           <w:szCs w:val="28"/>
         </w:rPr>
-        <w:t>While platforms like Etsy are global, they often come with challenges like international payment gateways, high listing fees, and global competition—factors that may not suit Indian artisans. Desi-Etsy solves these issues by offering a tailored, India-first solution with INR payments, local language support (planned), and features suited to small-scale entrepreneurs.</w:t>
+        <w:t>While platforms like Etsy are global, they often come with challenges like international payment gateways, high listing fees, and global competition—factors that may not suit Indian artisans.</w:t>
+      </w:r>
+    </w:p>
+    <w:p>
+      <w:pPr>
+        <w:jc w:val="both"/>
+        <w:rPr>
+          <w:sz w:val="28"/>
+          <w:szCs w:val="28"/>
+        </w:rPr>
+      </w:pPr>
+      <w:r>
+        <w:rPr>
+          <w:sz w:val="28"/>
+          <w:szCs w:val="28"/>
+        </w:rPr>
+        <w:lastRenderedPageBreak/>
+        <w:t>Desi-Etsy solves these issues by offering a tailored, India-first solution with INR payments, local language support (planned), and features suited to small-scale entrepreneurs.</w:t>
       </w:r>
     </w:p>
     <w:p>
@@ -551,7 +627,6 @@
           <w:sz w:val="36"/>
           <w:szCs w:val="36"/>
         </w:rPr>
-        <w:lastRenderedPageBreak/>
         <w:t>Empowering Indian Artisans</w:t>
       </w:r>
     </w:p>
@@ -752,7 +827,15 @@
           <w:sz w:val="28"/>
           <w:szCs w:val="28"/>
         </w:rPr>
-        <w:t xml:space="preserve">A central goal is to support artisans in gaining financial independence and visibility. By enabling artisans to register, list products, and manage orders without any technical expertise, the platform fosters inclusivity and economic empowerment. Furthermore, customer features like cart management, checkout, and real-time order tracking ensure a smooth shopping experience. The integration of </w:t>
+        <w:t xml:space="preserve">A central goal is to support artisans in gaining financial independence and visibility. By enabling artisans to register, list products, and manage orders without any technical expertise, the platform fosters inclusivity and economic empowerment. Furthermore, customer features like cart management, checkout, and real-time order tracking ensure a smooth shopping experience. </w:t>
+      </w:r>
+      <w:r>
+        <w:rPr>
+          <w:sz w:val="28"/>
+          <w:szCs w:val="28"/>
+        </w:rPr>
+        <w:lastRenderedPageBreak/>
+        <w:t xml:space="preserve">The integration of </w:t>
       </w:r>
       <w:proofErr w:type="spellStart"/>
       <w:r>
@@ -819,7 +902,6 @@
           <w:sz w:val="48"/>
           <w:szCs w:val="48"/>
         </w:rPr>
-        <w:lastRenderedPageBreak/>
         <w:t>Project Objectives</w:t>
       </w:r>
     </w:p>
@@ -1126,17 +1208,20 @@
     <w:p>
       <w:pPr>
         <w:rPr>
-          <w:sz w:val="28"/>
-          <w:szCs w:val="28"/>
-        </w:rPr>
-      </w:pPr>
-      <w:r>
-        <w:rPr>
-          <w:b/>
-          <w:bCs/>
-          <w:sz w:val="28"/>
-          <w:szCs w:val="28"/>
-        </w:rPr>
+          <w:b/>
+          <w:bCs/>
+          <w:sz w:val="28"/>
+          <w:szCs w:val="28"/>
+        </w:rPr>
+      </w:pPr>
+      <w:r>
+        <w:rPr>
+          <w:b/>
+          <w:bCs/>
+          <w:sz w:val="28"/>
+          <w:szCs w:val="28"/>
+        </w:rPr>
+        <w:lastRenderedPageBreak/>
         <w:t>Ensure Real-Time Communication (future scope)</w:t>
       </w:r>
       <w:r>
@@ -1145,7 +1230,21 @@
           <w:szCs w:val="28"/>
         </w:rPr>
         <w:br/>
-        <w:t>Plan for future integration of real-time customer-artisan chat for direct support and engagement.</w:t>
+        <w:t>Plan for future integration of real-time customer-artisan chat for direct support and</w:t>
+      </w:r>
+      <w:r>
+        <w:rPr>
+          <w:sz w:val="28"/>
+          <w:szCs w:val="28"/>
+        </w:rPr>
+        <w:t xml:space="preserve"> </w:t>
+      </w:r>
+      <w:r>
+        <w:rPr>
+          <w:sz w:val="28"/>
+          <w:szCs w:val="28"/>
+        </w:rPr>
+        <w:t>engagement.</w:t>
       </w:r>
     </w:p>
     <w:p>
@@ -1211,7 +1310,6 @@
           <w:sz w:val="28"/>
           <w:szCs w:val="28"/>
         </w:rPr>
-        <w:lastRenderedPageBreak/>
         <w:t>Ensure Security and Data Privacy</w:t>
       </w:r>
       <w:r>
@@ -1500,6 +1598,7 @@
           <w:sz w:val="28"/>
           <w:szCs w:val="28"/>
         </w:rPr>
+        <w:lastRenderedPageBreak/>
         <w:t>Customers can browse products by category, artisan name, or price.</w:t>
       </w:r>
     </w:p>
@@ -1614,7 +1713,6 @@
           <w:sz w:val="28"/>
           <w:szCs w:val="28"/>
         </w:rPr>
-        <w:lastRenderedPageBreak/>
         <w:t>Designed to be responsive and fast for a smooth shopping experience.</w:t>
       </w:r>
     </w:p>
@@ -2008,6 +2106,7 @@
           <w:sz w:val="28"/>
           <w:szCs w:val="28"/>
         </w:rPr>
+        <w:lastRenderedPageBreak/>
         <w:t xml:space="preserve">Integrated with </w:t>
       </w:r>
       <w:proofErr w:type="spellStart"/>
@@ -2157,7 +2256,6 @@
           <w:sz w:val="28"/>
           <w:szCs w:val="28"/>
         </w:rPr>
-        <w:lastRenderedPageBreak/>
         <w:t>Smooth navigation with minimal clicks and clear CTA buttons.</w:t>
       </w:r>
     </w:p>
@@ -2386,6 +2484,7 @@
           <w:sz w:val="28"/>
           <w:szCs w:val="28"/>
         </w:rPr>
+        <w:lastRenderedPageBreak/>
         <w:t>Express.js:</w:t>
       </w:r>
       <w:r>
@@ -2497,33 +2596,23 @@
           <w:szCs w:val="28"/>
         </w:rPr>
       </w:pPr>
-      <w:r>
-        <w:rPr>
-          <w:sz w:val="28"/>
-          <w:szCs w:val="28"/>
-        </w:rPr>
-        <w:pict w14:anchorId="2AF127A1">
-          <v:rect id="_x0000_i1326" style="width:0;height:1.5pt" o:hrstd="t" o:hr="t" fillcolor="#a0a0a0" stroked="f"/>
-        </w:pict>
-      </w:r>
-    </w:p>
-    <w:p>
-      <w:pPr>
-        <w:rPr>
-          <w:b/>
-          <w:bCs/>
-          <w:sz w:val="28"/>
-          <w:szCs w:val="28"/>
-        </w:rPr>
-      </w:pPr>
-      <w:r>
-        <w:rPr>
-          <w:b/>
-          <w:bCs/>
-          <w:sz w:val="28"/>
-          <w:szCs w:val="28"/>
-        </w:rPr>
-        <w:lastRenderedPageBreak/>
+    </w:p>
+    <w:p>
+      <w:pPr>
+        <w:rPr>
+          <w:b/>
+          <w:bCs/>
+          <w:sz w:val="28"/>
+          <w:szCs w:val="28"/>
+        </w:rPr>
+      </w:pPr>
+      <w:r>
+        <w:rPr>
+          <w:b/>
+          <w:bCs/>
+          <w:sz w:val="28"/>
+          <w:szCs w:val="28"/>
+        </w:rPr>
         <w:t>Authentication &amp; Security</w:t>
       </w:r>
     </w:p>
@@ -2749,6 +2838,7 @@
           <w:sz w:val="28"/>
           <w:szCs w:val="28"/>
         </w:rPr>
+        <w:lastRenderedPageBreak/>
         <w:t>Vercel</w:t>
       </w:r>
       <w:proofErr w:type="spellEnd"/>
@@ -2903,7 +2993,6 @@
           <w:sz w:val="28"/>
           <w:szCs w:val="28"/>
         </w:rPr>
-        <w:lastRenderedPageBreak/>
         <w:t>email: Unique identifier used for login and communication.</w:t>
       </w:r>
     </w:p>
@@ -3207,6 +3296,7 @@
           <w:sz w:val="28"/>
           <w:szCs w:val="28"/>
         </w:rPr>
+        <w:lastRenderedPageBreak/>
         <w:t>createdAt</w:t>
       </w:r>
       <w:proofErr w:type="spellEnd"/>
@@ -3570,7 +3660,6 @@
           <w:sz w:val="32"/>
           <w:szCs w:val="32"/>
         </w:rPr>
-        <w:lastRenderedPageBreak/>
         <w:t>4. OTP / Verification Token (Optional)</w:t>
       </w:r>
     </w:p>
@@ -3729,6 +3818,7 @@
           <w:sz w:val="28"/>
           <w:szCs w:val="28"/>
         </w:rPr>
+        <w:lastRenderedPageBreak/>
         <w:t>While the current version of Desi-Etsy delivers a fully functional and user-friendly e-commerce platform for Indian artisans, there is significant scope for future improvements to enhance user engagement, platform scalability, and market relevance. These enhancements are designed to meet evolving user needs and align with the long-term vision of the platform.</w:t>
       </w:r>
     </w:p>
@@ -3901,7 +3991,6 @@
           <w:sz w:val="28"/>
           <w:szCs w:val="28"/>
         </w:rPr>
-        <w:lastRenderedPageBreak/>
         <w:t>Multi-Language Support:</w:t>
       </w:r>
       <w:r>
@@ -4012,6 +4101,7 @@
           <w:sz w:val="28"/>
           <w:szCs w:val="28"/>
         </w:rPr>
+        <w:lastRenderedPageBreak/>
         <w:t xml:space="preserve">The platform not only </w:t>
       </w:r>
       <w:proofErr w:type="spellStart"/>
@@ -4141,7 +4231,6 @@
           <w:sz w:val="48"/>
           <w:szCs w:val="48"/>
         </w:rPr>
-        <w:lastRenderedPageBreak/>
         <w:t>Project Repository &amp; References</w:t>
       </w:r>
     </w:p>
@@ -4200,7 +4289,7 @@
         </w:rPr>
         <w:t xml:space="preserve"> </w:t>
       </w:r>
-      <w:hyperlink r:id="rId5" w:tgtFrame="_new" w:history="1">
+      <w:hyperlink r:id="rId7" w:tgtFrame="_new" w:history="1">
         <w:r>
           <w:rPr>
             <w:rStyle w:val="Hyperlink"/>
@@ -4268,7 +4357,7 @@
         </w:rPr>
         <w:t xml:space="preserve">MongoDB Best Practices – </w:t>
       </w:r>
-      <w:hyperlink r:id="rId6" w:tgtFrame="_new" w:history="1">
+      <w:hyperlink r:id="rId8" w:tgtFrame="_new" w:history="1">
         <w:r>
           <w:rPr>
             <w:rStyle w:val="Hyperlink"/>
@@ -4297,7 +4386,7 @@
         </w:rPr>
         <w:t xml:space="preserve">Express.js Guide – </w:t>
       </w:r>
-      <w:hyperlink r:id="rId7" w:tgtFrame="_new" w:history="1">
+      <w:hyperlink r:id="rId9" w:tgtFrame="_new" w:history="1">
         <w:r>
           <w:rPr>
             <w:rStyle w:val="Hyperlink"/>
@@ -4324,6 +4413,7 @@
           <w:sz w:val="28"/>
           <w:szCs w:val="28"/>
         </w:rPr>
+        <w:lastRenderedPageBreak/>
         <w:t>React.js Docs – https://reactjs.org/docs</w:t>
       </w:r>
     </w:p>
@@ -4345,7 +4435,7 @@
         </w:rPr>
         <w:t xml:space="preserve">Tailwind CSS – </w:t>
       </w:r>
-      <w:hyperlink r:id="rId8" w:tgtFrame="_new" w:history="1">
+      <w:hyperlink r:id="rId10" w:tgtFrame="_new" w:history="1">
         <w:r>
           <w:rPr>
             <w:rStyle w:val="Hyperlink"/>
@@ -4421,6 +4511,7 @@
       </w:pPr>
     </w:p>
     <w:sectPr>
+      <w:footerReference w:type="default" r:id="rId11"/>
       <w:pgSz w:w="12240" w:h="15840"/>
       <w:pgMar w:top="720" w:right="720" w:bottom="720" w:left="720" w:header="720" w:footer="1117" w:gutter="0"/>
       <w:cols w:space="708"/>
@@ -4428,6 +4519,66 @@
     </w:sectPr>
   </w:body>
 </w:document>
+</file>
+
+<file path=word/endnotes.xml><?xml version="1.0" encoding="utf-8"?>
+<w:endnotes xmlns:wpc="http://schemas.microsoft.com/office/word/2010/wordprocessingCanvas" xmlns:cx="http://schemas.microsoft.com/office/drawing/2014/chartex" xmlns:cx1="http://schemas.microsoft.com/office/drawing/2015/9/8/chartex" xmlns:cx2="http://schemas.microsoft.com/office/drawing/2015/10/21/chartex" xmlns:cx3="http://schemas.microsoft.com/office/drawing/2016/5/9/chartex" xmlns:cx4="http://schemas.microsoft.com/office/drawing/2016/5/10/chartex" xmlns:cx5="http://schemas.microsoft.com/office/drawing/2016/5/11/chartex" xmlns:cx6="http://schemas.microsoft.com/office/drawing/2016/5/12/chartex" xmlns:cx7="http://schemas.microsoft.com/office/drawing/2016/5/13/chartex" xmlns:cx8="http://schemas.microsoft.com/office/drawing/2016/5/14/chartex" xmlns:mc="http://schemas.openxmlformats.org/markup-compatibility/2006" xmlns:aink="http://schemas.microsoft.com/office/drawing/2016/ink" xmlns:am3d="http://schemas.microsoft.com/office/drawing/2017/model3d" xmlns:o="urn:schemas-microsoft-com:office:office" xmlns:oel="http://schemas.microsoft.com/office/2019/extlst" xmlns:r="http://schemas.openxmlformats.org/officeDocument/2006/relationships" xmlns:m="http://schemas.openxmlformats.org/officeDocument/2006/math" xmlns:v="urn:schemas-microsoft-com:vml" xmlns:wp14="http://schemas.microsoft.com/office/word/2010/wordprocessingDrawing" xmlns:wp="http://schemas.openxmlformats.org/drawingml/2006/wordprocessingDrawing" xmlns:w10="urn:schemas-microsoft-com:office:word" xmlns:w="http://schemas.openxmlformats.org/wordprocessingml/2006/main" xmlns:w14="http://schemas.microsoft.com/office/word/2010/wordml" xmlns:w15="http://schemas.microsoft.com/office/word/2012/wordml" xmlns:w16cex="http://schemas.microsoft.com/office/word/2018/wordml/cex" xmlns:w16cid="http://schemas.microsoft.com/office/word/2016/wordml/cid" xmlns:w16="http://schemas.microsoft.com/office/word/2018/wordml" xmlns:w16du="http://schemas.microsoft.com/office/word/2023/wordml/word16du" xmlns:w16sdtdh="http://schemas.microsoft.com/office/word/2020/wordml/sdtdatahash" xmlns:w16sdtfl="http://schemas.microsoft.com/office/word/2024/wordml/sdtformatlock" xmlns:w16se="http://schemas.microsoft.com/office/word/2015/wordml/symex" xmlns:wpg="http://schemas.microsoft.com/office/word/2010/wordprocessingGroup" xmlns:wpi="http://schemas.microsoft.com/office/word/2010/wordprocessingInk" xmlns:wne="http://schemas.microsoft.com/office/word/2006/wordml" xmlns:wps="http://schemas.microsoft.com/office/word/2010/wordprocessingShape" mc:Ignorable="w14 w15 w16se w16cid w16 w16cex w16sdtdh w16sdtfl w16du wp14">
+  <w:endnote w:type="separator" w:id="-1">
+    <w:p>
+      <w:pPr>
+        <w:spacing w:after="0" w:line="240" w:lineRule="auto"/>
+      </w:pPr>
+      <w:r>
+        <w:separator/>
+      </w:r>
+    </w:p>
+  </w:endnote>
+  <w:endnote w:type="continuationSeparator" w:id="0">
+    <w:p>
+      <w:pPr>
+        <w:spacing w:after="0" w:line="240" w:lineRule="auto"/>
+      </w:pPr>
+      <w:r>
+        <w:continuationSeparator/>
+      </w:r>
+    </w:p>
+  </w:endnote>
+</w:endnotes>
+</file>
+
+<file path=word/footer1.xml><?xml version="1.0" encoding="utf-8"?>
+<w:ftr xmlns:wpc="http://schemas.microsoft.com/office/word/2010/wordprocessingCanvas" xmlns:cx="http://schemas.microsoft.com/office/drawing/2014/chartex" xmlns:cx1="http://schemas.microsoft.com/office/drawing/2015/9/8/chartex" xmlns:cx2="http://schemas.microsoft.com/office/drawing/2015/10/21/chartex" xmlns:cx3="http://schemas.microsoft.com/office/drawing/2016/5/9/chartex" xmlns:cx4="http://schemas.microsoft.com/office/drawing/2016/5/10/chartex" xmlns:cx5="http://schemas.microsoft.com/office/drawing/2016/5/11/chartex" xmlns:cx6="http://schemas.microsoft.com/office/drawing/2016/5/12/chartex" xmlns:cx7="http://schemas.microsoft.com/office/drawing/2016/5/13/chartex" xmlns:cx8="http://schemas.microsoft.com/office/drawing/2016/5/14/chartex" xmlns:mc="http://schemas.openxmlformats.org/markup-compatibility/2006" xmlns:aink="http://schemas.microsoft.com/office/drawing/2016/ink" xmlns:am3d="http://schemas.microsoft.com/office/drawing/2017/model3d" xmlns:o="urn:schemas-microsoft-com:office:office" xmlns:oel="http://schemas.microsoft.com/office/2019/extlst" xmlns:r="http://schemas.openxmlformats.org/officeDocument/2006/relationships" xmlns:m="http://schemas.openxmlformats.org/officeDocument/2006/math" xmlns:v="urn:schemas-microsoft-com:vml" xmlns:wp14="http://schemas.microsoft.com/office/word/2010/wordprocessingDrawing" xmlns:wp="http://schemas.openxmlformats.org/drawingml/2006/wordprocessingDrawing" xmlns:w10="urn:schemas-microsoft-com:office:word" xmlns:w="http://schemas.openxmlformats.org/wordprocessingml/2006/main" xmlns:w14="http://schemas.microsoft.com/office/word/2010/wordml" xmlns:w15="http://schemas.microsoft.com/office/word/2012/wordml" xmlns:w16cex="http://schemas.microsoft.com/office/word/2018/wordml/cex" xmlns:w16cid="http://schemas.microsoft.com/office/word/2016/wordml/cid" xmlns:w16="http://schemas.microsoft.com/office/word/2018/wordml" xmlns:w16du="http://schemas.microsoft.com/office/word/2023/wordml/word16du" xmlns:w16sdtdh="http://schemas.microsoft.com/office/word/2020/wordml/sdtdatahash" xmlns:w16sdtfl="http://schemas.microsoft.com/office/word/2024/wordml/sdtformatlock" xmlns:w16se="http://schemas.microsoft.com/office/word/2015/wordml/symex" xmlns:wpg="http://schemas.microsoft.com/office/word/2010/wordprocessingGroup" xmlns:wpi="http://schemas.microsoft.com/office/word/2010/wordprocessingInk" xmlns:wne="http://schemas.microsoft.com/office/word/2006/wordml" xmlns:wps="http://schemas.microsoft.com/office/word/2010/wordprocessingShape" mc:Ignorable="w14 w15 w16se w16cid w16 w16cex w16sdtdh w16sdtfl w16du wp14">
+  <w:p>
+    <w:pPr>
+      <w:pStyle w:val="Footer"/>
+    </w:pPr>
+  </w:p>
+</w:ftr>
+</file>
+
+<file path=word/footnotes.xml><?xml version="1.0" encoding="utf-8"?>
+<w:footnotes xmlns:wpc="http://schemas.microsoft.com/office/word/2010/wordprocessingCanvas" xmlns:cx="http://schemas.microsoft.com/office/drawing/2014/chartex" xmlns:cx1="http://schemas.microsoft.com/office/drawing/2015/9/8/chartex" xmlns:cx2="http://schemas.microsoft.com/office/drawing/2015/10/21/chartex" xmlns:cx3="http://schemas.microsoft.com/office/drawing/2016/5/9/chartex" xmlns:cx4="http://schemas.microsoft.com/office/drawing/2016/5/10/chartex" xmlns:cx5="http://schemas.microsoft.com/office/drawing/2016/5/11/chartex" xmlns:cx6="http://schemas.microsoft.com/office/drawing/2016/5/12/chartex" xmlns:cx7="http://schemas.microsoft.com/office/drawing/2016/5/13/chartex" xmlns:cx8="http://schemas.microsoft.com/office/drawing/2016/5/14/chartex" xmlns:mc="http://schemas.openxmlformats.org/markup-compatibility/2006" xmlns:aink="http://schemas.microsoft.com/office/drawing/2016/ink" xmlns:am3d="http://schemas.microsoft.com/office/drawing/2017/model3d" xmlns:o="urn:schemas-microsoft-com:office:office" xmlns:oel="http://schemas.microsoft.com/office/2019/extlst" xmlns:r="http://schemas.openxmlformats.org/officeDocument/2006/relationships" xmlns:m="http://schemas.openxmlformats.org/officeDocument/2006/math" xmlns:v="urn:schemas-microsoft-com:vml" xmlns:wp14="http://schemas.microsoft.com/office/word/2010/wordprocessingDrawing" xmlns:wp="http://schemas.openxmlformats.org/drawingml/2006/wordprocessingDrawing" xmlns:w10="urn:schemas-microsoft-com:office:word" xmlns:w="http://schemas.openxmlformats.org/wordprocessingml/2006/main" xmlns:w14="http://schemas.microsoft.com/office/word/2010/wordml" xmlns:w15="http://schemas.microsoft.com/office/word/2012/wordml" xmlns:w16cex="http://schemas.microsoft.com/office/word/2018/wordml/cex" xmlns:w16cid="http://schemas.microsoft.com/office/word/2016/wordml/cid" xmlns:w16="http://schemas.microsoft.com/office/word/2018/wordml" xmlns:w16du="http://schemas.microsoft.com/office/word/2023/wordml/word16du" xmlns:w16sdtdh="http://schemas.microsoft.com/office/word/2020/wordml/sdtdatahash" xmlns:w16sdtfl="http://schemas.microsoft.com/office/word/2024/wordml/sdtformatlock" xmlns:w16se="http://schemas.microsoft.com/office/word/2015/wordml/symex" xmlns:wpg="http://schemas.microsoft.com/office/word/2010/wordprocessingGroup" xmlns:wpi="http://schemas.microsoft.com/office/word/2010/wordprocessingInk" xmlns:wne="http://schemas.microsoft.com/office/word/2006/wordml" xmlns:wps="http://schemas.microsoft.com/office/word/2010/wordprocessingShape" mc:Ignorable="w14 w15 w16se w16cid w16 w16cex w16sdtdh w16sdtfl w16du wp14">
+  <w:footnote w:type="separator" w:id="-1">
+    <w:p>
+      <w:pPr>
+        <w:spacing w:after="0" w:line="240" w:lineRule="auto"/>
+      </w:pPr>
+      <w:r>
+        <w:separator/>
+      </w:r>
+    </w:p>
+  </w:footnote>
+  <w:footnote w:type="continuationSeparator" w:id="0">
+    <w:p>
+      <w:pPr>
+        <w:spacing w:after="0" w:line="240" w:lineRule="auto"/>
+      </w:pPr>
+      <w:r>
+        <w:continuationSeparator/>
+      </w:r>
+    </w:p>
+  </w:footnote>
+</w:footnotes>
 </file>
 
 <file path=word/numbering.xml><?xml version="1.0" encoding="utf-8"?>
@@ -9302,6 +9453,7 @@
   <w:style w:type="character" w:default="1" w:styleId="DefaultParagraphFont">
     <w:name w:val="Default Paragraph Font"/>
     <w:uiPriority w:val="1"/>
+    <w:semiHidden/>
     <w:unhideWhenUsed/>
   </w:style>
   <w:style w:type="table" w:default="1" w:styleId="TableNormal">
@@ -9638,6 +9790,50 @@
       <w:shd w:val="clear" w:color="auto" w:fill="E1DFDD"/>
     </w:rPr>
   </w:style>
+  <w:style w:type="paragraph" w:styleId="Header">
+    <w:name w:val="header"/>
+    <w:basedOn w:val="Normal"/>
+    <w:link w:val="HeaderChar"/>
+    <w:uiPriority w:val="99"/>
+    <w:unhideWhenUsed/>
+    <w:rsid w:val="000D6548"/>
+    <w:pPr>
+      <w:tabs>
+        <w:tab w:val="center" w:pos="4513"/>
+        <w:tab w:val="right" w:pos="9026"/>
+      </w:tabs>
+      <w:spacing w:after="0" w:line="240" w:lineRule="auto"/>
+    </w:pPr>
+  </w:style>
+  <w:style w:type="character" w:customStyle="1" w:styleId="HeaderChar">
+    <w:name w:val="Header Char"/>
+    <w:basedOn w:val="DefaultParagraphFont"/>
+    <w:link w:val="Header"/>
+    <w:uiPriority w:val="99"/>
+    <w:rsid w:val="000D6548"/>
+  </w:style>
+  <w:style w:type="paragraph" w:styleId="Footer">
+    <w:name w:val="footer"/>
+    <w:basedOn w:val="Normal"/>
+    <w:link w:val="FooterChar"/>
+    <w:uiPriority w:val="99"/>
+    <w:unhideWhenUsed/>
+    <w:rsid w:val="000D6548"/>
+    <w:pPr>
+      <w:tabs>
+        <w:tab w:val="center" w:pos="4513"/>
+        <w:tab w:val="right" w:pos="9026"/>
+      </w:tabs>
+      <w:spacing w:after="0" w:line="240" w:lineRule="auto"/>
+    </w:pPr>
+  </w:style>
+  <w:style w:type="character" w:customStyle="1" w:styleId="FooterChar">
+    <w:name w:val="Footer Char"/>
+    <w:basedOn w:val="DefaultParagraphFont"/>
+    <w:link w:val="Footer"/>
+    <w:uiPriority w:val="99"/>
+    <w:rsid w:val="000D6548"/>
+  </w:style>
 </w:styles>
 </file>
 

</xml_diff>